<commit_message>
Feat: sync_atlas bi-directionnel avec fallback SSL, tri decroissant global, ajustement bon de livraison et documentation
</commit_message>
<xml_diff>
--- a/DOCUMENTATION/Guide_Utilisation_Marmite_du_Kloto.docx
+++ b/DOCUMENTATION/Guide_Utilisation_Marmite_du_Kloto.docx
@@ -563,6 +563,84 @@
         <w:t>NABINE Tassounti</w:t>
       </w:r>
     </w:p>
+    <w:p>
+      <w:pPr>
+        <w:pStyle w:val="Heading1"/>
+      </w:pPr>
+      <w:r>
+        <w:t>Fiche de Mise à Jour — Nouveautés &amp; Ergonomie</w:t>
+      </w:r>
+    </w:p>
+    <w:p>
+      <w:pPr>
+        <w:pStyle w:val="Heading2"/>
+      </w:pPr>
+      <w:r>
+        <w:t>1. Tri Décroissant Généralisé (Dernières Opérations / Servies en Haut)</w:t>
+      </w:r>
+    </w:p>
+    <w:p>
+      <w:r>
+        <w:t>Afin de faciliter la consultation rapide lors des pics d'activité :</w:t>
+        <w:br/>
+        <w:t>• Sur l'écran Ventes : les nouvelles commandes actives s'affichent immédiatement au sommet de la liste.</w:t>
+        <w:br/>
+        <w:t>• Sur l'écran Livraison : le détail des courses du jour pour chaque livreur classe les livraisons les plus récentes en 1ère position.</w:t>
+        <w:br/>
+        <w:t>• Sur l'écran Cuisine : l'historique des repas servis présente les derniers plats préparés tout en haut.</w:t>
+        <w:br/>
+        <w:t>• Sur l'écran À emporter : l'historique des ventes à emporter clôturées affiche les opérations les plus récentes en tête.</w:t>
+        <w:br/>
+        <w:t>• Sur les écrans Dépenses &amp; Stock : le journal des dépenses et des mouvements de stock classe les entrées de la plus récente à la plus ancienne.</w:t>
+      </w:r>
+    </w:p>
+    <w:p>
+      <w:pPr>
+        <w:pStyle w:val="Heading2"/>
+      </w:pPr>
+      <w:r>
+        <w:t>2. Émission Immédiate du Bon de Livraison (Commandes Bar / Sans Cuisine)</w:t>
+      </w:r>
+    </w:p>
+    <w:p>
+      <w:r>
+        <w:t>Lorsqu'une commande à livrer ne contient que des articles de bar (boissons, bières, vin...) et aucun plat de cuisine :</w:t>
+        <w:br/>
+        <w:t>• La validation génère et ouvre automatiquement le Bon de Livraison officiel (nom du client, adresse, livreur attribué, montant à encaisser).</w:t>
+        <w:br/>
+        <w:t>• Aucun bon de cuisine inutile n'est imprimé et le livreur peut partir immédiatement.</w:t>
+      </w:r>
+    </w:p>
+    <w:p>
+      <w:pPr>
+        <w:pStyle w:val="Heading2"/>
+      </w:pPr>
+      <w:r>
+        <w:t>3. Historique Consultable par Date sur l'Écran À Emporter</w:t>
+      </w:r>
+    </w:p>
+    <w:p>
+      <w:r>
+        <w:t>L'écran À emporter (/emporter) intègre désormais un sélecteur de date interactif (avec calendrier et navigation jour par jour ‹ et ›) :</w:t>
+        <w:br/>
+        <w:t>• Permet de consulter l'historique complet des commandes à emporter clôturées pour n'importe quelle date passée.</w:t>
+        <w:br/>
+        <w:t>• Propose un bouton 📄 Reçu pour chaque vente afin d'imprimer ou réimprimer le reçu officiel.</w:t>
+      </w:r>
+    </w:p>
+    <w:p>
+      <w:pPr>
+        <w:pStyle w:val="Heading2"/>
+      </w:pPr>
+      <w:r>
+        <w:t>4. Gestion et Suivi des Comptes Livreurs</w:t>
+      </w:r>
+    </w:p>
+    <w:p>
+      <w:r>
+        <w:t>Sur l'écran Livraison (/livraison), tous les livreurs sont clairement répertoriés avec le détail de leurs courses du jour, leurs recettes encaissées à remettre en caisse et l'historique par date.</w:t>
+      </w:r>
+    </w:p>
     <w:sectPr>
       <w:pgSz w:w="12240" w:h="15840"/>
       <w:pgMar w:top="1008" w:right="1008" w:bottom="1008" w:left="1008" w:header="720" w:footer="720" w:gutter="0"/>

</xml_diff>